<commit_message>
Fix format for payoff letters
</commit_message>
<xml_diff>
--- a/templates/Payoff_Letter_Template_2_Lien.docx
+++ b/templates/Payoff_Letter_Template_2_Lien.docx
@@ -63,19 +63,11 @@
         <w:br/>
       </w:r>
       <w:r>
-        <w:t>{{</w:t>
-      </w:r>
-      <w:r>
-        <w:rPr>
-          <w:bCs/>
-          <w:iCs/>
-          <w:sz w:val="24"/>
-          <w:szCs w:val="24"/>
-        </w:rPr>
-        <w:t>ADDRESS</w:t>
-      </w:r>
-      <w:r>
-        <w:t>}}</w:t>
+        <w:t>3225 McLeod Dr Suite 100,</w:t>
+      </w:r>
+      <w:r>
+        <w:br/>
+        <w:t>Las Vegas, NV 89121</w:t>
       </w:r>
     </w:p>
     <w:p>
@@ -142,6 +134,12 @@
         <w:t xml:space="preserve">d </w:t>
       </w:r>
       <w:r>
+        <w:rPr>
+          <w:b/>
+          <w:i/>
+          <w:sz w:val="20"/>
+          <w:szCs w:val="18"/>
+        </w:rPr>
         <w:t>{{</w:t>
       </w:r>
       <w:r>
@@ -163,6 +161,12 @@
         <w:t>ATE</w:t>
       </w:r>
       <w:r>
+        <w:rPr>
+          <w:b/>
+          <w:i/>
+          <w:sz w:val="20"/>
+          <w:szCs w:val="18"/>
+        </w:rPr>
         <w:t>}}</w:t>
       </w:r>
       <w:r>
@@ -193,33 +197,19 @@
         <w:t xml:space="preserve"> </w:t>
       </w:r>
       <w:r>
-        <w:rPr>
-          <w:b/>
-          <w:i/>
-          <w:sz w:val="20"/>
-          <w:szCs w:val="18"/>
-        </w:rPr>
-        <w:t xml:space="preserve">23110 </w:t>
-      </w:r>
-      <w:proofErr w:type="spellStart"/>
-      <w:r>
-        <w:rPr>
-          <w:b/>
-          <w:i/>
-          <w:sz w:val="20"/>
-          <w:szCs w:val="18"/>
-        </w:rPr>
-        <w:t>Pennsgrove</w:t>
-      </w:r>
-      <w:proofErr w:type="spellEnd"/>
-      <w:r>
-        <w:rPr>
-          <w:b/>
-          <w:i/>
-          <w:sz w:val="20"/>
-          <w:szCs w:val="18"/>
-        </w:rPr>
-        <w:t xml:space="preserve"> Rd Spring, TX 77373</w:t>
+        <w:t>{{</w:t>
+      </w:r>
+      <w:r>
+        <w:rPr>
+          <w:bCs/>
+          <w:iCs/>
+          <w:sz w:val="24"/>
+          <w:szCs w:val="24"/>
+        </w:rPr>
+        <w:t>ADDRESS</w:t>
+      </w:r>
+      <w:r>
+        <w:t>}}</w:t>
       </w:r>
     </w:p>
     <w:p>

</xml_diff>